<commit_message>
fix: update guides with correct Netlify URL (kanun-monitoring)
</commit_message>
<xml_diff>
--- a/KaNun-Agency-Owner-Guide.docx
+++ b/KaNun-Agency-Owner-Guide.docx
@@ -146,14 +146,14 @@
       <w:pPr>
         <w:spacing w:after="200"/>
       </w:pPr>
-      <w:hyperlink w:history="1" r:id="rId8wmk_1u8dnx6ivsndgjju">
+      <w:hyperlink w:history="1" r:id="rIdhoyxff_n7et3dwegaywky">
         <w:r>
           <w:rPr>
             <w:rStyle w:val="Hyperlink"/>
             <w:sz w:val="22"/>
             <w:szCs w:val="22"/>
           </w:rPr>
-          <w:t xml:space="preserve">https://kanun-sv-platform.netlify.app/signup</w:t>
+          <w:t xml:space="preserve">https://kanun-monitoring.netlify.app/signup</w:t>
         </w:r>
       </w:hyperlink>
     </w:p>
@@ -644,7 +644,7 @@
         <w:spacing w:after="80"/>
       </w:pPr>
       <w:r>
-        <w:t xml:space="preserve">The link looks like: https://kanun-sv-platform.netlify.app/signup?email=monitor@example.com</w:t>
+        <w:t xml:space="preserve">The link looks like: https://kanun-monitoring.netlify.app/signup?email=monitor@example.com</w:t>
       </w:r>
     </w:p>
     <w:p>

</xml_diff>